<commit_message>
feat(database): implementacion de persistencia local SQLite para iteracion 4
Se agregaron los scripts de inicializacion, capa de persistencia (db_manager), pruebas unitarias y actualizacion de requirements.txt.
</commit_message>
<xml_diff>
--- a/docs/Reporte_Semana01_Monitoreo_Ciberseguridad_CarlosReyez.docx
+++ b/docs/Reporte_Semana01_Monitoreo_Ciberseguridad_CarlosReyez.docx
@@ -1,6 +1,6 @@
 
 <file path=word/document.xml><?xml version="1.0" encoding="utf-8"?>
-<w:document xmlns:wpc="http://schemas.microsoft.com/office/word/2010/wordprocessingCanvas" xmlns:cx="http://schemas.microsoft.com/office/drawing/2014/chartex" xmlns:cx1="http://schemas.microsoft.com/office/drawing/2015/9/8/chartex" xmlns:cx2="http://schemas.microsoft.com/office/drawing/2015/10/21/chartex" xmlns:cx3="http://schemas.microsoft.com/office/drawing/2016/5/9/chartex" xmlns:cx4="http://schemas.microsoft.com/office/drawing/2016/5/10/chartex" xmlns:cx5="http://schemas.microsoft.com/office/drawing/2016/5/11/chartex" xmlns:cx6="http://schemas.microsoft.com/office/drawing/2016/5/12/chartex" xmlns:cx7="http://schemas.microsoft.com/office/drawing/2016/5/13/chartex" xmlns:cx8="http://schemas.microsoft.com/office/drawing/2016/5/14/chartex" xmlns:mc="http://schemas.openxmlformats.org/markup-compatibility/2006" xmlns:aink="http://schemas.microsoft.com/office/drawing/2016/ink" xmlns:am3d="http://schemas.microsoft.com/office/drawing/2017/model3d" xmlns:o="urn:schemas-microsoft-com:office:office" xmlns:oel="http://schemas.microsoft.com/office/2019/extlst" xmlns:r="http://schemas.openxmlformats.org/officeDocument/2006/relationships" xmlns:m="http://schemas.openxmlformats.org/officeDocument/2006/math" xmlns:v="urn:schemas-microsoft-com:vml" xmlns:wp14="http://schemas.microsoft.com/office/word/2010/wordprocessingDrawing" xmlns:wp="http://schemas.openxmlformats.org/drawingml/2006/wordprocessingDrawing" xmlns:w10="urn:schemas-microsoft-com:office:word" xmlns:w="http://schemas.openxmlformats.org/wordprocessingml/2006/main" xmlns:w14="http://schemas.microsoft.com/office/word/2010/wordml" xmlns:w15="http://schemas.microsoft.com/office/word/2012/wordml" xmlns:w16cex="http://schemas.microsoft.com/office/word/2018/wordml/cex" xmlns:w16cid="http://schemas.microsoft.com/office/word/2016/wordml/cid" xmlns:w16="http://schemas.microsoft.com/office/word/2018/wordml" xmlns:w16du="http://schemas.microsoft.com/office/word/2023/wordml/word16du" xmlns:w16sdtdh="http://schemas.microsoft.com/office/word/2020/wordml/sdtdatahash" xmlns:w16sdtfl="http://schemas.microsoft.com/office/word/2024/wordml/sdtformatlock" xmlns:w16se="http://schemas.microsoft.com/office/word/2015/wordml/symex" xmlns:wpg="http://schemas.microsoft.com/office/word/2010/wordprocessingGroup" xmlns:wpi="http://schemas.microsoft.com/office/word/2010/wordprocessingInk" xmlns:wne="http://schemas.microsoft.com/office/word/2006/wordml" xmlns:wps="http://schemas.microsoft.com/office/word/2010/wordprocessingShape" mc:Ignorable="w14 w15 w16se w16cid w16 w16cex w16sdtdh w16sdtfl w16du wp14">
+<w:document xmlns:wpc="http://schemas.microsoft.com/office/word/2010/wordprocessingCanvas" xmlns:cx="http://schemas.microsoft.com/office/drawing/2014/chartex" xmlns:cx1="http://schemas.microsoft.com/office/drawing/2015/9/8/chartex" xmlns:cx2="http://schemas.microsoft.com/office/drawing/2015/10/21/chartex" xmlns:cx3="http://schemas.microsoft.com/office/drawing/2016/5/9/chartex" xmlns:cx4="http://schemas.microsoft.com/office/drawing/2016/5/10/chartex" xmlns:cx5="http://schemas.microsoft.com/office/drawing/2016/5/11/chartex" xmlns:cx6="http://schemas.microsoft.com/office/drawing/2016/5/12/chartex" xmlns:cx7="http://schemas.microsoft.com/office/drawing/2016/5/13/chartex" xmlns:cx8="http://schemas.microsoft.com/office/drawing/2016/5/14/chartex" xmlns:mc="http://schemas.openxmlformats.org/markup-compatibility/2006" xmlns:aink="http://schemas.microsoft.com/office/drawing/2016/ink" xmlns:am3d="http://schemas.microsoft.com/office/drawing/2017/model3d" xmlns:o="urn:schemas-microsoft-com:office:office" xmlns:oel="http://schemas.microsoft.com/office/2019/extlst" xmlns:r="http://schemas.openxmlformats.org/officeDocument/2006/relationships" xmlns:m="http://schemas.openxmlformats.org/officeDocument/2006/math" xmlns:v="urn:schemas-microsoft-com:vml" xmlns:wp14="http://schemas.microsoft.com/office/word/2010/wordprocessingDrawing" xmlns:wp="http://schemas.openxmlformats.org/drawingml/2006/wordprocessingDrawing" xmlns:w10="urn:schemas-microsoft-com:office:word" xmlns:w="http://schemas.openxmlformats.org/wordprocessingml/2006/main" xmlns:w14="http://schemas.microsoft.com/office/word/2010/wordml" xmlns:w15="http://schemas.microsoft.com/office/word/2012/wordml" xmlns:w16cex="http://schemas.microsoft.com/office/word/2018/wordml/cex" xmlns:w16cid="http://schemas.microsoft.com/office/word/2016/wordml/cid" xmlns:w16="http://schemas.microsoft.com/office/word/2018/wordml" xmlns:w16sdtdh="http://schemas.microsoft.com/office/word/2020/wordml/sdtdatahash" xmlns:w16se="http://schemas.microsoft.com/office/word/2015/wordml/symex" xmlns:wpg="http://schemas.microsoft.com/office/word/2010/wordprocessingGroup" xmlns:wpi="http://schemas.microsoft.com/office/word/2010/wordprocessingInk" xmlns:wne="http://schemas.microsoft.com/office/word/2006/wordml" xmlns:wps="http://schemas.microsoft.com/office/word/2010/wordprocessingShape" mc:Ignorable="w14 w15 w16se w16cid w16 w16cex w16sdtdh wp14">
   <w:body>
     <w:p>
       <w:pPr>
@@ -549,15 +549,15 @@
     </w:p>
     <w:tbl>
       <w:tblPr>
-        <w:tblStyle w:val="Tablaconcuadrcula5oscura-nfasis4"/>
+        <w:tblStyle w:val="Tablaconcuadrcula4-nfasis4"/>
         <w:tblW w:w="0" w:type="auto"/>
         <w:tblLook w:val="04A0" w:firstRow="1" w:lastRow="0" w:firstColumn="1" w:lastColumn="0" w:noHBand="0" w:noVBand="1"/>
       </w:tblPr>
       <w:tblGrid>
-        <w:gridCol w:w="4111"/>
-        <w:gridCol w:w="2112"/>
-        <w:gridCol w:w="1123"/>
-        <w:gridCol w:w="1482"/>
+        <w:gridCol w:w="4449"/>
+        <w:gridCol w:w="2115"/>
+        <w:gridCol w:w="1126"/>
+        <w:gridCol w:w="1138"/>
       </w:tblGrid>
       <w:tr>
         <w:trPr>
@@ -693,18 +693,14 @@
           <w:p>
             <w:pPr>
               <w:spacing w:after="160" w:line="278" w:lineRule="auto"/>
-              <w:jc w:val="center"/>
-              <w:rPr>
-                <w:rFonts w:ascii="Arial" w:hAnsi="Arial" w:cs="Arial"/>
-                <w:b w:val="0"/>
-                <w:bCs w:val="0"/>
+              <w:jc w:val="both"/>
+              <w:rPr>
+                <w:rFonts w:ascii="Arial" w:hAnsi="Arial" w:cs="Arial"/>
               </w:rPr>
             </w:pPr>
             <w:r>
               <w:rPr>
                 <w:rFonts w:ascii="Arial" w:hAnsi="Arial" w:cs="Arial"/>
-                <w:b w:val="0"/>
-                <w:bCs w:val="0"/>
               </w:rPr>
               <w:t xml:space="preserve">Identificar </w:t>
             </w:r>
@@ -712,8 +708,6 @@
             <w:r>
               <w:rPr>
                 <w:rFonts w:ascii="Arial" w:hAnsi="Arial" w:cs="Arial"/>
-                <w:b w:val="0"/>
-                <w:bCs w:val="0"/>
               </w:rPr>
               <w:t>stakeholders</w:t>
             </w:r>
@@ -721,8 +715,6 @@
             <w:r>
               <w:rPr>
                 <w:rFonts w:ascii="Arial" w:hAnsi="Arial" w:cs="Arial"/>
-                <w:b w:val="0"/>
-                <w:bCs w:val="0"/>
               </w:rPr>
               <w:t xml:space="preserve"> y objetivos</w:t>
             </w:r>
@@ -736,7 +728,7 @@
           <w:p>
             <w:pPr>
               <w:spacing w:after="160" w:line="278" w:lineRule="auto"/>
-              <w:jc w:val="center"/>
+              <w:jc w:val="both"/>
               <w:cnfStyle w:val="000000100000" w:firstRow="0" w:lastRow="0" w:firstColumn="0" w:lastColumn="0" w:oddVBand="0" w:evenVBand="0" w:oddHBand="1" w:evenHBand="0" w:firstRowFirstColumn="0" w:firstRowLastColumn="0" w:lastRowFirstColumn="0" w:lastRowLastColumn="0"/>
               <w:rPr>
                 <w:rFonts w:ascii="Arial" w:hAnsi="Arial" w:cs="Arial"/>
@@ -758,7 +750,7 @@
           <w:p>
             <w:pPr>
               <w:spacing w:after="160" w:line="278" w:lineRule="auto"/>
-              <w:jc w:val="center"/>
+              <w:jc w:val="both"/>
               <w:cnfStyle w:val="000000100000" w:firstRow="0" w:lastRow="0" w:firstColumn="0" w:lastColumn="0" w:oddVBand="0" w:evenVBand="0" w:oddHBand="1" w:evenHBand="0" w:firstRowFirstColumn="0" w:firstRowLastColumn="0" w:lastRowFirstColumn="0" w:lastRowLastColumn="0"/>
               <w:rPr>
                 <w:rFonts w:ascii="Arial" w:hAnsi="Arial" w:cs="Arial"/>
@@ -768,16 +760,8 @@
               <w:rPr>
                 <w:rFonts w:ascii="Arial" w:hAnsi="Arial" w:cs="Arial"/>
               </w:rPr>
-              <w:t xml:space="preserve">1 </w:t>
+              <w:t>1.0</w:t>
             </w:r>
-            <w:proofErr w:type="spellStart"/>
-            <w:r>
-              <w:rPr>
-                <w:rFonts w:ascii="Arial" w:hAnsi="Arial" w:cs="Arial"/>
-              </w:rPr>
-              <w:t>hr</w:t>
-            </w:r>
-            <w:proofErr w:type="spellEnd"/>
           </w:p>
         </w:tc>
         <w:tc>
@@ -788,7 +772,7 @@
           <w:p>
             <w:pPr>
               <w:spacing w:after="160" w:line="278" w:lineRule="auto"/>
-              <w:jc w:val="center"/>
+              <w:jc w:val="both"/>
               <w:cnfStyle w:val="000000100000" w:firstRow="0" w:lastRow="0" w:firstColumn="0" w:lastColumn="0" w:oddVBand="0" w:evenVBand="0" w:oddHBand="1" w:evenHBand="0" w:firstRowFirstColumn="0" w:firstRowLastColumn="0" w:lastRowFirstColumn="0" w:lastRowLastColumn="0"/>
               <w:rPr>
                 <w:rFonts w:ascii="Arial" w:hAnsi="Arial" w:cs="Arial"/>
@@ -798,7 +782,7 @@
               <w:rPr>
                 <w:rFonts w:ascii="Arial" w:hAnsi="Arial" w:cs="Arial"/>
               </w:rPr>
-              <w:t>45 min</w:t>
+              <w:t>0.75</w:t>
             </w:r>
           </w:p>
         </w:tc>
@@ -813,18 +797,14 @@
           <w:p>
             <w:pPr>
               <w:spacing w:after="160" w:line="278" w:lineRule="auto"/>
-              <w:jc w:val="center"/>
-              <w:rPr>
-                <w:rFonts w:ascii="Arial" w:hAnsi="Arial" w:cs="Arial"/>
-                <w:b w:val="0"/>
-                <w:bCs w:val="0"/>
+              <w:jc w:val="both"/>
+              <w:rPr>
+                <w:rFonts w:ascii="Arial" w:hAnsi="Arial" w:cs="Arial"/>
               </w:rPr>
             </w:pPr>
             <w:r>
               <w:rPr>
                 <w:rFonts w:ascii="Arial" w:hAnsi="Arial" w:cs="Arial"/>
-                <w:b w:val="0"/>
-                <w:bCs w:val="0"/>
               </w:rPr>
               <w:t>Recopilar requisitos funcionales</w:t>
             </w:r>
@@ -838,7 +818,7 @@
           <w:p>
             <w:pPr>
               <w:spacing w:after="160" w:line="278" w:lineRule="auto"/>
-              <w:jc w:val="center"/>
+              <w:jc w:val="both"/>
               <w:cnfStyle w:val="000000000000" w:firstRow="0" w:lastRow="0" w:firstColumn="0" w:lastColumn="0" w:oddVBand="0" w:evenVBand="0" w:oddHBand="0" w:evenHBand="0" w:firstRowFirstColumn="0" w:firstRowLastColumn="0" w:lastRowFirstColumn="0" w:lastRowLastColumn="0"/>
               <w:rPr>
                 <w:rFonts w:ascii="Arial" w:hAnsi="Arial" w:cs="Arial"/>
@@ -860,7 +840,7 @@
           <w:p>
             <w:pPr>
               <w:spacing w:after="160" w:line="278" w:lineRule="auto"/>
-              <w:jc w:val="center"/>
+              <w:jc w:val="both"/>
               <w:cnfStyle w:val="000000000000" w:firstRow="0" w:lastRow="0" w:firstColumn="0" w:lastColumn="0" w:oddVBand="0" w:evenVBand="0" w:oddHBand="0" w:evenHBand="0" w:firstRowFirstColumn="0" w:firstRowLastColumn="0" w:lastRowFirstColumn="0" w:lastRowLastColumn="0"/>
               <w:rPr>
                 <w:rFonts w:ascii="Arial" w:hAnsi="Arial" w:cs="Arial"/>
@@ -870,16 +850,8 @@
               <w:rPr>
                 <w:rFonts w:ascii="Arial" w:hAnsi="Arial" w:cs="Arial"/>
               </w:rPr>
-              <w:t xml:space="preserve">2 </w:t>
+              <w:t>2.0</w:t>
             </w:r>
-            <w:proofErr w:type="spellStart"/>
-            <w:r>
-              <w:rPr>
-                <w:rFonts w:ascii="Arial" w:hAnsi="Arial" w:cs="Arial"/>
-              </w:rPr>
-              <w:t>hr</w:t>
-            </w:r>
-            <w:proofErr w:type="spellEnd"/>
           </w:p>
         </w:tc>
         <w:tc>
@@ -890,7 +862,7 @@
           <w:p>
             <w:pPr>
               <w:spacing w:after="160" w:line="278" w:lineRule="auto"/>
-              <w:jc w:val="center"/>
+              <w:jc w:val="both"/>
               <w:cnfStyle w:val="000000000000" w:firstRow="0" w:lastRow="0" w:firstColumn="0" w:lastColumn="0" w:oddVBand="0" w:evenVBand="0" w:oddHBand="0" w:evenHBand="0" w:firstRowFirstColumn="0" w:firstRowLastColumn="0" w:lastRowFirstColumn="0" w:lastRowLastColumn="0"/>
               <w:rPr>
                 <w:rFonts w:ascii="Arial" w:hAnsi="Arial" w:cs="Arial"/>
@@ -900,7 +872,7 @@
               <w:rPr>
                 <w:rFonts w:ascii="Arial" w:hAnsi="Arial" w:cs="Arial"/>
               </w:rPr>
-              <w:t>2hrs 40 min</w:t>
+              <w:t>2.67</w:t>
             </w:r>
           </w:p>
         </w:tc>
@@ -918,18 +890,14 @@
           <w:p>
             <w:pPr>
               <w:spacing w:after="160" w:line="278" w:lineRule="auto"/>
-              <w:jc w:val="center"/>
-              <w:rPr>
-                <w:rFonts w:ascii="Arial" w:hAnsi="Arial" w:cs="Arial"/>
-                <w:b w:val="0"/>
-                <w:bCs w:val="0"/>
+              <w:jc w:val="both"/>
+              <w:rPr>
+                <w:rFonts w:ascii="Arial" w:hAnsi="Arial" w:cs="Arial"/>
               </w:rPr>
             </w:pPr>
             <w:r>
               <w:rPr>
                 <w:rFonts w:ascii="Arial" w:hAnsi="Arial" w:cs="Arial"/>
-                <w:b w:val="0"/>
-                <w:bCs w:val="0"/>
               </w:rPr>
               <w:t>Formular iteraciones del proyecto</w:t>
             </w:r>
@@ -943,7 +911,7 @@
           <w:p>
             <w:pPr>
               <w:spacing w:after="160" w:line="278" w:lineRule="auto"/>
-              <w:jc w:val="center"/>
+              <w:jc w:val="both"/>
               <w:cnfStyle w:val="000000100000" w:firstRow="0" w:lastRow="0" w:firstColumn="0" w:lastColumn="0" w:oddVBand="0" w:evenVBand="0" w:oddHBand="1" w:evenHBand="0" w:firstRowFirstColumn="0" w:firstRowLastColumn="0" w:lastRowFirstColumn="0" w:lastRowLastColumn="0"/>
               <w:rPr>
                 <w:rFonts w:ascii="Arial" w:hAnsi="Arial" w:cs="Arial"/>
@@ -965,7 +933,7 @@
           <w:p>
             <w:pPr>
               <w:spacing w:after="160" w:line="278" w:lineRule="auto"/>
-              <w:jc w:val="center"/>
+              <w:jc w:val="both"/>
               <w:cnfStyle w:val="000000100000" w:firstRow="0" w:lastRow="0" w:firstColumn="0" w:lastColumn="0" w:oddVBand="0" w:evenVBand="0" w:oddHBand="1" w:evenHBand="0" w:firstRowFirstColumn="0" w:firstRowLastColumn="0" w:lastRowFirstColumn="0" w:lastRowLastColumn="0"/>
               <w:rPr>
                 <w:rFonts w:ascii="Arial" w:hAnsi="Arial" w:cs="Arial"/>
@@ -975,22 +943,8 @@
               <w:rPr>
                 <w:rFonts w:ascii="Arial" w:hAnsi="Arial" w:cs="Arial"/>
               </w:rPr>
-              <w:t>1</w:t>
+              <w:t>1.0</w:t>
             </w:r>
-            <w:r>
-              <w:rPr>
-                <w:rFonts w:ascii="Arial" w:hAnsi="Arial" w:cs="Arial"/>
-              </w:rPr>
-              <w:t xml:space="preserve"> </w:t>
-            </w:r>
-            <w:proofErr w:type="spellStart"/>
-            <w:r>
-              <w:rPr>
-                <w:rFonts w:ascii="Arial" w:hAnsi="Arial" w:cs="Arial"/>
-              </w:rPr>
-              <w:t>hr</w:t>
-            </w:r>
-            <w:proofErr w:type="spellEnd"/>
           </w:p>
         </w:tc>
         <w:tc>
@@ -1001,7 +955,7 @@
           <w:p>
             <w:pPr>
               <w:spacing w:after="160" w:line="278" w:lineRule="auto"/>
-              <w:jc w:val="center"/>
+              <w:jc w:val="both"/>
               <w:cnfStyle w:val="000000100000" w:firstRow="0" w:lastRow="0" w:firstColumn="0" w:lastColumn="0" w:oddVBand="0" w:evenVBand="0" w:oddHBand="1" w:evenHBand="0" w:firstRowFirstColumn="0" w:firstRowLastColumn="0" w:lastRowFirstColumn="0" w:lastRowLastColumn="0"/>
               <w:rPr>
                 <w:rFonts w:ascii="Arial" w:hAnsi="Arial" w:cs="Arial"/>
@@ -1011,7 +965,7 @@
               <w:rPr>
                 <w:rFonts w:ascii="Arial" w:hAnsi="Arial" w:cs="Arial"/>
               </w:rPr>
-              <w:t>1hr 10 min</w:t>
+              <w:t>1.17</w:t>
             </w:r>
           </w:p>
         </w:tc>
@@ -1026,18 +980,14 @@
           <w:p>
             <w:pPr>
               <w:spacing w:after="160" w:line="278" w:lineRule="auto"/>
-              <w:jc w:val="center"/>
-              <w:rPr>
-                <w:rFonts w:ascii="Arial" w:hAnsi="Arial" w:cs="Arial"/>
-                <w:b w:val="0"/>
-                <w:bCs w:val="0"/>
+              <w:jc w:val="both"/>
+              <w:rPr>
+                <w:rFonts w:ascii="Arial" w:hAnsi="Arial" w:cs="Arial"/>
               </w:rPr>
             </w:pPr>
             <w:r>
               <w:rPr>
                 <w:rFonts w:ascii="Arial" w:hAnsi="Arial" w:cs="Arial"/>
-                <w:b w:val="0"/>
-                <w:bCs w:val="0"/>
               </w:rPr>
               <w:t>Definir criterios de aceptación</w:t>
             </w:r>
@@ -1051,7 +1001,7 @@
           <w:p>
             <w:pPr>
               <w:spacing w:after="160" w:line="278" w:lineRule="auto"/>
-              <w:jc w:val="center"/>
+              <w:jc w:val="both"/>
               <w:cnfStyle w:val="000000000000" w:firstRow="0" w:lastRow="0" w:firstColumn="0" w:lastColumn="0" w:oddVBand="0" w:evenVBand="0" w:oddHBand="0" w:evenHBand="0" w:firstRowFirstColumn="0" w:firstRowLastColumn="0" w:lastRowFirstColumn="0" w:lastRowLastColumn="0"/>
               <w:rPr>
                 <w:rFonts w:ascii="Arial" w:hAnsi="Arial" w:cs="Arial"/>
@@ -1073,7 +1023,7 @@
           <w:p>
             <w:pPr>
               <w:spacing w:after="160" w:line="278" w:lineRule="auto"/>
-              <w:jc w:val="center"/>
+              <w:jc w:val="both"/>
               <w:cnfStyle w:val="000000000000" w:firstRow="0" w:lastRow="0" w:firstColumn="0" w:lastColumn="0" w:oddVBand="0" w:evenVBand="0" w:oddHBand="0" w:evenHBand="0" w:firstRowFirstColumn="0" w:firstRowLastColumn="0" w:lastRowFirstColumn="0" w:lastRowLastColumn="0"/>
               <w:rPr>
                 <w:rFonts w:ascii="Arial" w:hAnsi="Arial" w:cs="Arial"/>
@@ -1083,22 +1033,8 @@
               <w:rPr>
                 <w:rFonts w:ascii="Arial" w:hAnsi="Arial" w:cs="Arial"/>
               </w:rPr>
-              <w:t>1</w:t>
+              <w:t>1.0</w:t>
             </w:r>
-            <w:r>
-              <w:rPr>
-                <w:rFonts w:ascii="Arial" w:hAnsi="Arial" w:cs="Arial"/>
-              </w:rPr>
-              <w:t xml:space="preserve"> </w:t>
-            </w:r>
-            <w:proofErr w:type="spellStart"/>
-            <w:r>
-              <w:rPr>
-                <w:rFonts w:ascii="Arial" w:hAnsi="Arial" w:cs="Arial"/>
-              </w:rPr>
-              <w:t>hr</w:t>
-            </w:r>
-            <w:proofErr w:type="spellEnd"/>
           </w:p>
         </w:tc>
         <w:tc>
@@ -1109,7 +1045,7 @@
           <w:p>
             <w:pPr>
               <w:spacing w:after="160" w:line="278" w:lineRule="auto"/>
-              <w:jc w:val="center"/>
+              <w:jc w:val="both"/>
               <w:cnfStyle w:val="000000000000" w:firstRow="0" w:lastRow="0" w:firstColumn="0" w:lastColumn="0" w:oddVBand="0" w:evenVBand="0" w:oddHBand="0" w:evenHBand="0" w:firstRowFirstColumn="0" w:firstRowLastColumn="0" w:lastRowFirstColumn="0" w:lastRowLastColumn="0"/>
               <w:rPr>
                 <w:rFonts w:ascii="Arial" w:hAnsi="Arial" w:cs="Arial"/>
@@ -1119,21 +1055,7 @@
               <w:rPr>
                 <w:rFonts w:ascii="Arial" w:hAnsi="Arial" w:cs="Arial"/>
               </w:rPr>
-              <w:t xml:space="preserve">1 </w:t>
-            </w:r>
-            <w:proofErr w:type="spellStart"/>
-            <w:r>
-              <w:rPr>
-                <w:rFonts w:ascii="Arial" w:hAnsi="Arial" w:cs="Arial"/>
-              </w:rPr>
-              <w:t>hr</w:t>
-            </w:r>
-            <w:proofErr w:type="spellEnd"/>
-            <w:r>
-              <w:rPr>
-                <w:rFonts w:ascii="Arial" w:hAnsi="Arial" w:cs="Arial"/>
-              </w:rPr>
-              <w:t xml:space="preserve"> 25 min</w:t>
+              <w:t>1.42</w:t>
             </w:r>
           </w:p>
         </w:tc>
@@ -1151,18 +1073,14 @@
           <w:p>
             <w:pPr>
               <w:spacing w:after="160" w:line="278" w:lineRule="auto"/>
-              <w:jc w:val="center"/>
-              <w:rPr>
-                <w:rFonts w:ascii="Arial" w:hAnsi="Arial" w:cs="Arial"/>
-                <w:b w:val="0"/>
-                <w:bCs w:val="0"/>
+              <w:jc w:val="both"/>
+              <w:rPr>
+                <w:rFonts w:ascii="Arial" w:hAnsi="Arial" w:cs="Arial"/>
               </w:rPr>
             </w:pPr>
             <w:r>
               <w:rPr>
                 <w:rFonts w:ascii="Arial" w:hAnsi="Arial" w:cs="Arial"/>
-                <w:b w:val="0"/>
-                <w:bCs w:val="0"/>
               </w:rPr>
               <w:t>Diseñar casos y escenarios de prueba</w:t>
             </w:r>
@@ -1176,7 +1094,7 @@
           <w:p>
             <w:pPr>
               <w:spacing w:after="160" w:line="278" w:lineRule="auto"/>
-              <w:jc w:val="center"/>
+              <w:jc w:val="both"/>
               <w:cnfStyle w:val="000000100000" w:firstRow="0" w:lastRow="0" w:firstColumn="0" w:lastColumn="0" w:oddVBand="0" w:evenVBand="0" w:oddHBand="1" w:evenHBand="0" w:firstRowFirstColumn="0" w:firstRowLastColumn="0" w:lastRowFirstColumn="0" w:lastRowLastColumn="0"/>
               <w:rPr>
                 <w:rFonts w:ascii="Arial" w:hAnsi="Arial" w:cs="Arial"/>
@@ -1198,7 +1116,7 @@
           <w:p>
             <w:pPr>
               <w:spacing w:after="160" w:line="278" w:lineRule="auto"/>
-              <w:jc w:val="center"/>
+              <w:jc w:val="both"/>
               <w:cnfStyle w:val="000000100000" w:firstRow="0" w:lastRow="0" w:firstColumn="0" w:lastColumn="0" w:oddVBand="0" w:evenVBand="0" w:oddHBand="1" w:evenHBand="0" w:firstRowFirstColumn="0" w:firstRowLastColumn="0" w:lastRowFirstColumn="0" w:lastRowLastColumn="0"/>
               <w:rPr>
                 <w:rFonts w:ascii="Arial" w:hAnsi="Arial" w:cs="Arial"/>
@@ -1208,22 +1126,8 @@
               <w:rPr>
                 <w:rFonts w:ascii="Arial" w:hAnsi="Arial" w:cs="Arial"/>
               </w:rPr>
-              <w:t>1</w:t>
+              <w:t>1.0</w:t>
             </w:r>
-            <w:r>
-              <w:rPr>
-                <w:rFonts w:ascii="Arial" w:hAnsi="Arial" w:cs="Arial"/>
-              </w:rPr>
-              <w:t xml:space="preserve"> </w:t>
-            </w:r>
-            <w:proofErr w:type="spellStart"/>
-            <w:r>
-              <w:rPr>
-                <w:rFonts w:ascii="Arial" w:hAnsi="Arial" w:cs="Arial"/>
-              </w:rPr>
-              <w:t>hr</w:t>
-            </w:r>
-            <w:proofErr w:type="spellEnd"/>
           </w:p>
         </w:tc>
         <w:tc>
@@ -1234,7 +1138,7 @@
           <w:p>
             <w:pPr>
               <w:spacing w:after="160" w:line="278" w:lineRule="auto"/>
-              <w:jc w:val="center"/>
+              <w:jc w:val="both"/>
               <w:cnfStyle w:val="000000100000" w:firstRow="0" w:lastRow="0" w:firstColumn="0" w:lastColumn="0" w:oddVBand="0" w:evenVBand="0" w:oddHBand="1" w:evenHBand="0" w:firstRowFirstColumn="0" w:firstRowLastColumn="0" w:lastRowFirstColumn="0" w:lastRowLastColumn="0"/>
               <w:rPr>
                 <w:rFonts w:ascii="Arial" w:hAnsi="Arial" w:cs="Arial"/>
@@ -1244,7 +1148,7 @@
               <w:rPr>
                 <w:rFonts w:ascii="Arial" w:hAnsi="Arial" w:cs="Arial"/>
               </w:rPr>
-              <w:t>55 min</w:t>
+              <w:t>0.92</w:t>
             </w:r>
           </w:p>
         </w:tc>
@@ -1259,18 +1163,14 @@
           <w:p>
             <w:pPr>
               <w:spacing w:after="160" w:line="278" w:lineRule="auto"/>
-              <w:jc w:val="center"/>
-              <w:rPr>
-                <w:rFonts w:ascii="Arial" w:hAnsi="Arial" w:cs="Arial"/>
-                <w:b w:val="0"/>
-                <w:bCs w:val="0"/>
+              <w:jc w:val="both"/>
+              <w:rPr>
+                <w:rFonts w:ascii="Arial" w:hAnsi="Arial" w:cs="Arial"/>
               </w:rPr>
             </w:pPr>
             <w:r>
               <w:rPr>
                 <w:rFonts w:ascii="Arial" w:hAnsi="Arial" w:cs="Arial"/>
-                <w:b w:val="0"/>
-                <w:bCs w:val="0"/>
               </w:rPr>
               <w:t>Refinar descripciones y criterios</w:t>
             </w:r>
@@ -1284,7 +1184,7 @@
           <w:p>
             <w:pPr>
               <w:spacing w:after="160" w:line="278" w:lineRule="auto"/>
-              <w:jc w:val="center"/>
+              <w:jc w:val="both"/>
               <w:cnfStyle w:val="000000000000" w:firstRow="0" w:lastRow="0" w:firstColumn="0" w:lastColumn="0" w:oddVBand="0" w:evenVBand="0" w:oddHBand="0" w:evenHBand="0" w:firstRowFirstColumn="0" w:firstRowLastColumn="0" w:lastRowFirstColumn="0" w:lastRowLastColumn="0"/>
               <w:rPr>
                 <w:rFonts w:ascii="Arial" w:hAnsi="Arial" w:cs="Arial"/>
@@ -1306,7 +1206,7 @@
           <w:p>
             <w:pPr>
               <w:spacing w:after="160" w:line="278" w:lineRule="auto"/>
-              <w:jc w:val="center"/>
+              <w:jc w:val="both"/>
               <w:cnfStyle w:val="000000000000" w:firstRow="0" w:lastRow="0" w:firstColumn="0" w:lastColumn="0" w:oddVBand="0" w:evenVBand="0" w:oddHBand="0" w:evenHBand="0" w:firstRowFirstColumn="0" w:firstRowLastColumn="0" w:lastRowFirstColumn="0" w:lastRowLastColumn="0"/>
               <w:rPr>
                 <w:rFonts w:ascii="Arial" w:hAnsi="Arial" w:cs="Arial"/>
@@ -1316,16 +1216,8 @@
               <w:rPr>
                 <w:rFonts w:ascii="Arial" w:hAnsi="Arial" w:cs="Arial"/>
               </w:rPr>
-              <w:t xml:space="preserve">1 </w:t>
+              <w:t>1.0</w:t>
             </w:r>
-            <w:proofErr w:type="spellStart"/>
-            <w:r>
-              <w:rPr>
-                <w:rFonts w:ascii="Arial" w:hAnsi="Arial" w:cs="Arial"/>
-              </w:rPr>
-              <w:t>hr</w:t>
-            </w:r>
-            <w:proofErr w:type="spellEnd"/>
           </w:p>
         </w:tc>
         <w:tc>
@@ -1336,7 +1228,7 @@
           <w:p>
             <w:pPr>
               <w:spacing w:after="160" w:line="278" w:lineRule="auto"/>
-              <w:jc w:val="center"/>
+              <w:jc w:val="both"/>
               <w:cnfStyle w:val="000000000000" w:firstRow="0" w:lastRow="0" w:firstColumn="0" w:lastColumn="0" w:oddVBand="0" w:evenVBand="0" w:oddHBand="0" w:evenHBand="0" w:firstRowFirstColumn="0" w:firstRowLastColumn="0" w:lastRowFirstColumn="0" w:lastRowLastColumn="0"/>
               <w:rPr>
                 <w:rFonts w:ascii="Arial" w:hAnsi="Arial" w:cs="Arial"/>
@@ -1346,7 +1238,7 @@
               <w:rPr>
                 <w:rFonts w:ascii="Arial" w:hAnsi="Arial" w:cs="Arial"/>
               </w:rPr>
-              <w:t>40 min</w:t>
+              <w:t>0.67</w:t>
             </w:r>
           </w:p>
         </w:tc>
@@ -1364,18 +1256,14 @@
           <w:p>
             <w:pPr>
               <w:spacing w:after="160" w:line="278" w:lineRule="auto"/>
-              <w:jc w:val="center"/>
-              <w:rPr>
-                <w:rFonts w:ascii="Arial" w:hAnsi="Arial" w:cs="Arial"/>
-                <w:b w:val="0"/>
-                <w:bCs w:val="0"/>
+              <w:jc w:val="both"/>
+              <w:rPr>
+                <w:rFonts w:ascii="Arial" w:hAnsi="Arial" w:cs="Arial"/>
               </w:rPr>
             </w:pPr>
             <w:r>
               <w:rPr>
                 <w:rFonts w:ascii="Arial" w:hAnsi="Arial" w:cs="Arial"/>
-                <w:b w:val="0"/>
-                <w:bCs w:val="0"/>
               </w:rPr>
               <w:t>Instalación y configuración de entorno</w:t>
             </w:r>
@@ -1389,7 +1277,7 @@
           <w:p>
             <w:pPr>
               <w:spacing w:after="160" w:line="278" w:lineRule="auto"/>
-              <w:jc w:val="center"/>
+              <w:jc w:val="both"/>
               <w:cnfStyle w:val="000000100000" w:firstRow="0" w:lastRow="0" w:firstColumn="0" w:lastColumn="0" w:oddVBand="0" w:evenVBand="0" w:oddHBand="1" w:evenHBand="0" w:firstRowFirstColumn="0" w:firstRowLastColumn="0" w:lastRowFirstColumn="0" w:lastRowLastColumn="0"/>
               <w:rPr>
                 <w:rFonts w:ascii="Arial" w:hAnsi="Arial" w:cs="Arial"/>
@@ -1411,7 +1299,7 @@
           <w:p>
             <w:pPr>
               <w:spacing w:after="160" w:line="278" w:lineRule="auto"/>
-              <w:jc w:val="center"/>
+              <w:jc w:val="both"/>
               <w:cnfStyle w:val="000000100000" w:firstRow="0" w:lastRow="0" w:firstColumn="0" w:lastColumn="0" w:oddVBand="0" w:evenVBand="0" w:oddHBand="1" w:evenHBand="0" w:firstRowFirstColumn="0" w:firstRowLastColumn="0" w:lastRowFirstColumn="0" w:lastRowLastColumn="0"/>
               <w:rPr>
                 <w:rFonts w:ascii="Arial" w:hAnsi="Arial" w:cs="Arial"/>
@@ -1421,22 +1309,8 @@
               <w:rPr>
                 <w:rFonts w:ascii="Arial" w:hAnsi="Arial" w:cs="Arial"/>
               </w:rPr>
-              <w:t>2</w:t>
+              <w:t>2.0</w:t>
             </w:r>
-            <w:r>
-              <w:rPr>
-                <w:rFonts w:ascii="Arial" w:hAnsi="Arial" w:cs="Arial"/>
-              </w:rPr>
-              <w:t xml:space="preserve"> </w:t>
-            </w:r>
-            <w:proofErr w:type="spellStart"/>
-            <w:r>
-              <w:rPr>
-                <w:rFonts w:ascii="Arial" w:hAnsi="Arial" w:cs="Arial"/>
-              </w:rPr>
-              <w:t>hrs</w:t>
-            </w:r>
-            <w:proofErr w:type="spellEnd"/>
           </w:p>
         </w:tc>
         <w:tc>
@@ -1447,7 +1321,7 @@
           <w:p>
             <w:pPr>
               <w:spacing w:after="160" w:line="278" w:lineRule="auto"/>
-              <w:jc w:val="center"/>
+              <w:jc w:val="both"/>
               <w:cnfStyle w:val="000000100000" w:firstRow="0" w:lastRow="0" w:firstColumn="0" w:lastColumn="0" w:oddVBand="0" w:evenVBand="0" w:oddHBand="1" w:evenHBand="0" w:firstRowFirstColumn="0" w:firstRowLastColumn="0" w:lastRowFirstColumn="0" w:lastRowLastColumn="0"/>
               <w:rPr>
                 <w:rFonts w:ascii="Arial" w:hAnsi="Arial" w:cs="Arial"/>
@@ -1457,27 +1331,7 @@
               <w:rPr>
                 <w:rFonts w:ascii="Arial" w:hAnsi="Arial" w:cs="Arial"/>
               </w:rPr>
-              <w:t>2</w:t>
-            </w:r>
-            <w:r>
-              <w:rPr>
-                <w:rFonts w:ascii="Arial" w:hAnsi="Arial" w:cs="Arial"/>
-              </w:rPr>
-              <w:t xml:space="preserve"> </w:t>
-            </w:r>
-            <w:proofErr w:type="spellStart"/>
-            <w:r>
-              <w:rPr>
-                <w:rFonts w:ascii="Arial" w:hAnsi="Arial" w:cs="Arial"/>
-              </w:rPr>
-              <w:t>hrs</w:t>
-            </w:r>
-            <w:proofErr w:type="spellEnd"/>
-            <w:r>
-              <w:rPr>
-                <w:rFonts w:ascii="Arial" w:hAnsi="Arial" w:cs="Arial"/>
-              </w:rPr>
-              <w:t xml:space="preserve"> 20 min</w:t>
+              <w:t>2.33</w:t>
             </w:r>
           </w:p>
         </w:tc>
@@ -1492,18 +1346,14 @@
           <w:p>
             <w:pPr>
               <w:spacing w:after="160" w:line="278" w:lineRule="auto"/>
-              <w:jc w:val="center"/>
-              <w:rPr>
-                <w:rFonts w:ascii="Arial" w:hAnsi="Arial" w:cs="Arial"/>
-                <w:b w:val="0"/>
-                <w:bCs w:val="0"/>
+              <w:jc w:val="both"/>
+              <w:rPr>
+                <w:rFonts w:ascii="Arial" w:hAnsi="Arial" w:cs="Arial"/>
               </w:rPr>
             </w:pPr>
             <w:r>
               <w:rPr>
                 <w:rFonts w:ascii="Arial" w:hAnsi="Arial" w:cs="Arial"/>
-                <w:b w:val="0"/>
-                <w:bCs w:val="0"/>
               </w:rPr>
               <w:t>TOTAL</w:t>
             </w:r>
@@ -1517,7 +1367,7 @@
           <w:p>
             <w:pPr>
               <w:spacing w:after="160" w:line="278" w:lineRule="auto"/>
-              <w:jc w:val="center"/>
+              <w:jc w:val="both"/>
               <w:cnfStyle w:val="000000000000" w:firstRow="0" w:lastRow="0" w:firstColumn="0" w:lastColumn="0" w:oddVBand="0" w:evenVBand="0" w:oddHBand="0" w:evenHBand="0" w:firstRowFirstColumn="0" w:firstRowLastColumn="0" w:lastRowFirstColumn="0" w:lastRowLastColumn="0"/>
               <w:rPr>
                 <w:rFonts w:ascii="Arial" w:hAnsi="Arial" w:cs="Arial"/>
@@ -1533,7 +1383,7 @@
           <w:p>
             <w:pPr>
               <w:spacing w:after="160" w:line="278" w:lineRule="auto"/>
-              <w:jc w:val="center"/>
+              <w:jc w:val="both"/>
               <w:cnfStyle w:val="000000000000" w:firstRow="0" w:lastRow="0" w:firstColumn="0" w:lastColumn="0" w:oddVBand="0" w:evenVBand="0" w:oddHBand="0" w:evenHBand="0" w:firstRowFirstColumn="0" w:firstRowLastColumn="0" w:lastRowFirstColumn="0" w:lastRowLastColumn="0"/>
               <w:rPr>
                 <w:rFonts w:ascii="Arial" w:hAnsi="Arial" w:cs="Arial"/>
@@ -1543,16 +1393,8 @@
               <w:rPr>
                 <w:rFonts w:ascii="Arial" w:hAnsi="Arial" w:cs="Arial"/>
               </w:rPr>
-              <w:t xml:space="preserve">9 </w:t>
+              <w:t>9.0</w:t>
             </w:r>
-            <w:proofErr w:type="spellStart"/>
-            <w:r>
-              <w:rPr>
-                <w:rFonts w:ascii="Arial" w:hAnsi="Arial" w:cs="Arial"/>
-              </w:rPr>
-              <w:t>hrs</w:t>
-            </w:r>
-            <w:proofErr w:type="spellEnd"/>
           </w:p>
         </w:tc>
         <w:tc>
@@ -1563,7 +1405,7 @@
           <w:p>
             <w:pPr>
               <w:spacing w:after="160" w:line="278" w:lineRule="auto"/>
-              <w:jc w:val="center"/>
+              <w:jc w:val="both"/>
               <w:cnfStyle w:val="000000000000" w:firstRow="0" w:lastRow="0" w:firstColumn="0" w:lastColumn="0" w:oddVBand="0" w:evenVBand="0" w:oddHBand="0" w:evenHBand="0" w:firstRowFirstColumn="0" w:firstRowLastColumn="0" w:lastRowFirstColumn="0" w:lastRowLastColumn="0"/>
               <w:rPr>
                 <w:rFonts w:ascii="Arial" w:hAnsi="Arial" w:cs="Arial"/>
@@ -1573,21 +1415,7 @@
               <w:rPr>
                 <w:rFonts w:ascii="Arial" w:hAnsi="Arial" w:cs="Arial"/>
               </w:rPr>
-              <w:t xml:space="preserve">9 </w:t>
-            </w:r>
-            <w:proofErr w:type="spellStart"/>
-            <w:r>
-              <w:rPr>
-                <w:rFonts w:ascii="Arial" w:hAnsi="Arial" w:cs="Arial"/>
-              </w:rPr>
-              <w:t>hrs</w:t>
-            </w:r>
-            <w:proofErr w:type="spellEnd"/>
-            <w:r>
-              <w:rPr>
-                <w:rFonts w:ascii="Arial" w:hAnsi="Arial" w:cs="Arial"/>
-              </w:rPr>
-              <w:t xml:space="preserve"> 55 min</w:t>
+              <w:t>9.93</w:t>
             </w:r>
           </w:p>
         </w:tc>
@@ -1642,6 +1470,7 @@
           <w:rFonts w:ascii="Arial" w:hAnsi="Arial" w:cs="Arial"/>
           <w:b/>
           <w:bCs/>
+          <w:noProof/>
         </w:rPr>
         <w:drawing>
           <wp:inline distT="0" distB="0" distL="0" distR="0" wp14:anchorId="57CA11E0" wp14:editId="0772B3C6">
@@ -1718,6 +1547,7 @@
       <w:r>
         <w:rPr>
           <w:rFonts w:ascii="Arial" w:hAnsi="Arial" w:cs="Arial"/>
+          <w:noProof/>
         </w:rPr>
         <w:lastRenderedPageBreak/>
         <w:drawing>
@@ -1782,7 +1612,7 @@
 </file>
 
 <file path=word/numbering.xml><?xml version="1.0" encoding="utf-8"?>
-<w:numbering xmlns:wpc="http://schemas.microsoft.com/office/word/2010/wordprocessingCanvas" xmlns:cx="http://schemas.microsoft.com/office/drawing/2014/chartex" xmlns:cx1="http://schemas.microsoft.com/office/drawing/2015/9/8/chartex" xmlns:cx2="http://schemas.microsoft.com/office/drawing/2015/10/21/chartex" xmlns:cx3="http://schemas.microsoft.com/office/drawing/2016/5/9/chartex" xmlns:cx4="http://schemas.microsoft.com/office/drawing/2016/5/10/chartex" xmlns:cx5="http://schemas.microsoft.com/office/drawing/2016/5/11/chartex" xmlns:cx6="http://schemas.microsoft.com/office/drawing/2016/5/12/chartex" xmlns:cx7="http://schemas.microsoft.com/office/drawing/2016/5/13/chartex" xmlns:cx8="http://schemas.microsoft.com/office/drawing/2016/5/14/chartex" xmlns:mc="http://schemas.openxmlformats.org/markup-compatibility/2006" xmlns:aink="http://schemas.microsoft.com/office/drawing/2016/ink" xmlns:am3d="http://schemas.microsoft.com/office/drawing/2017/model3d" xmlns:o="urn:schemas-microsoft-com:office:office" xmlns:oel="http://schemas.microsoft.com/office/2019/extlst" xmlns:r="http://schemas.openxmlformats.org/officeDocument/2006/relationships" xmlns:m="http://schemas.openxmlformats.org/officeDocument/2006/math" xmlns:v="urn:schemas-microsoft-com:vml" xmlns:wp14="http://schemas.microsoft.com/office/word/2010/wordprocessingDrawing" xmlns:wp="http://schemas.openxmlformats.org/drawingml/2006/wordprocessingDrawing" xmlns:w10="urn:schemas-microsoft-com:office:word" xmlns:w="http://schemas.openxmlformats.org/wordprocessingml/2006/main" xmlns:w14="http://schemas.microsoft.com/office/word/2010/wordml" xmlns:w15="http://schemas.microsoft.com/office/word/2012/wordml" xmlns:w16cex="http://schemas.microsoft.com/office/word/2018/wordml/cex" xmlns:w16cid="http://schemas.microsoft.com/office/word/2016/wordml/cid" xmlns:w16="http://schemas.microsoft.com/office/word/2018/wordml" xmlns:w16du="http://schemas.microsoft.com/office/word/2023/wordml/word16du" xmlns:w16sdtdh="http://schemas.microsoft.com/office/word/2020/wordml/sdtdatahash" xmlns:w16sdtfl="http://schemas.microsoft.com/office/word/2024/wordml/sdtformatlock" xmlns:w16se="http://schemas.microsoft.com/office/word/2015/wordml/symex" xmlns:wpg="http://schemas.microsoft.com/office/word/2010/wordprocessingGroup" xmlns:wpi="http://schemas.microsoft.com/office/word/2010/wordprocessingInk" xmlns:wne="http://schemas.microsoft.com/office/word/2006/wordml" xmlns:wps="http://schemas.microsoft.com/office/word/2010/wordprocessingShape" mc:Ignorable="w14 w15 w16se w16cid w16 w16cex w16sdtdh w16sdtfl w16du wp14">
+<w:numbering xmlns:wpc="http://schemas.microsoft.com/office/word/2010/wordprocessingCanvas" xmlns:cx="http://schemas.microsoft.com/office/drawing/2014/chartex" xmlns:cx1="http://schemas.microsoft.com/office/drawing/2015/9/8/chartex" xmlns:cx2="http://schemas.microsoft.com/office/drawing/2015/10/21/chartex" xmlns:cx3="http://schemas.microsoft.com/office/drawing/2016/5/9/chartex" xmlns:cx4="http://schemas.microsoft.com/office/drawing/2016/5/10/chartex" xmlns:cx5="http://schemas.microsoft.com/office/drawing/2016/5/11/chartex" xmlns:cx6="http://schemas.microsoft.com/office/drawing/2016/5/12/chartex" xmlns:cx7="http://schemas.microsoft.com/office/drawing/2016/5/13/chartex" xmlns:cx8="http://schemas.microsoft.com/office/drawing/2016/5/14/chartex" xmlns:mc="http://schemas.openxmlformats.org/markup-compatibility/2006" xmlns:aink="http://schemas.microsoft.com/office/drawing/2016/ink" xmlns:am3d="http://schemas.microsoft.com/office/drawing/2017/model3d" xmlns:o="urn:schemas-microsoft-com:office:office" xmlns:oel="http://schemas.microsoft.com/office/2019/extlst" xmlns:r="http://schemas.openxmlformats.org/officeDocument/2006/relationships" xmlns:m="http://schemas.openxmlformats.org/officeDocument/2006/math" xmlns:v="urn:schemas-microsoft-com:vml" xmlns:wp14="http://schemas.microsoft.com/office/word/2010/wordprocessingDrawing" xmlns:wp="http://schemas.openxmlformats.org/drawingml/2006/wordprocessingDrawing" xmlns:w10="urn:schemas-microsoft-com:office:word" xmlns:w="http://schemas.openxmlformats.org/wordprocessingml/2006/main" xmlns:w14="http://schemas.microsoft.com/office/word/2010/wordml" xmlns:w15="http://schemas.microsoft.com/office/word/2012/wordml" xmlns:w16cex="http://schemas.microsoft.com/office/word/2018/wordml/cex" xmlns:w16cid="http://schemas.microsoft.com/office/word/2016/wordml/cid" xmlns:w16="http://schemas.microsoft.com/office/word/2018/wordml" xmlns:w16sdtdh="http://schemas.microsoft.com/office/word/2020/wordml/sdtdatahash" xmlns:w16se="http://schemas.microsoft.com/office/word/2015/wordml/symex" xmlns:wpg="http://schemas.microsoft.com/office/word/2010/wordprocessingGroup" xmlns:wpi="http://schemas.microsoft.com/office/word/2010/wordprocessingInk" xmlns:wne="http://schemas.microsoft.com/office/word/2006/wordml" xmlns:wps="http://schemas.microsoft.com/office/word/2010/wordprocessingShape" mc:Ignorable="w14 w15 w16se w16cid w16 w16cex w16sdtdh wp14">
   <w:abstractNum w:abstractNumId="0" w15:restartNumberingAfterBreak="0">
     <w:nsid w:val="037C6716"/>
     <w:multiLevelType w:val="hybridMultilevel"/>
@@ -3141,7 +2971,7 @@
 </file>
 
 <file path=word/styles.xml><?xml version="1.0" encoding="utf-8"?>
-<w:styles xmlns:mc="http://schemas.openxmlformats.org/markup-compatibility/2006" xmlns:r="http://schemas.openxmlformats.org/officeDocument/2006/relationships" xmlns:w="http://schemas.openxmlformats.org/wordprocessingml/2006/main" xmlns:w14="http://schemas.microsoft.com/office/word/2010/wordml" xmlns:w15="http://schemas.microsoft.com/office/word/2012/wordml" xmlns:w16cex="http://schemas.microsoft.com/office/word/2018/wordml/cex" xmlns:w16cid="http://schemas.microsoft.com/office/word/2016/wordml/cid" xmlns:w16="http://schemas.microsoft.com/office/word/2018/wordml" xmlns:w16du="http://schemas.microsoft.com/office/word/2023/wordml/word16du" xmlns:w16sdtdh="http://schemas.microsoft.com/office/word/2020/wordml/sdtdatahash" xmlns:w16sdtfl="http://schemas.microsoft.com/office/word/2024/wordml/sdtformatlock" xmlns:w16se="http://schemas.microsoft.com/office/word/2015/wordml/symex" mc:Ignorable="w14 w15 w16se w16cid w16 w16cex w16sdtdh w16sdtfl w16du">
+<w:styles xmlns:mc="http://schemas.openxmlformats.org/markup-compatibility/2006" xmlns:r="http://schemas.openxmlformats.org/officeDocument/2006/relationships" xmlns:w="http://schemas.openxmlformats.org/wordprocessingml/2006/main" xmlns:w14="http://schemas.microsoft.com/office/word/2010/wordml" xmlns:w15="http://schemas.microsoft.com/office/word/2012/wordml" xmlns:w16cex="http://schemas.microsoft.com/office/word/2018/wordml/cex" xmlns:w16cid="http://schemas.microsoft.com/office/word/2016/wordml/cid" xmlns:w16="http://schemas.microsoft.com/office/word/2018/wordml" xmlns:w16sdtdh="http://schemas.microsoft.com/office/word/2020/wordml/sdtdatahash" xmlns:w16se="http://schemas.microsoft.com/office/word/2015/wordml/symex" mc:Ignorable="w14 w15 w16se w16cid w16 w16cex w16sdtdh">
   <w:docDefaults>
     <w:rPrDefault>
       <w:rPr>
@@ -4162,6 +3992,82 @@
       </w:tcPr>
     </w:tblStylePr>
   </w:style>
+  <w:style w:type="table" w:styleId="Tablaconcuadrcula4-nfasis4">
+    <w:name w:val="Grid Table 4 Accent 4"/>
+    <w:basedOn w:val="Tablanormal"/>
+    <w:uiPriority w:val="49"/>
+    <w:rsid w:val="000062B6"/>
+    <w:pPr>
+      <w:spacing w:after="0" w:line="240" w:lineRule="auto"/>
+    </w:pPr>
+    <w:tblPr>
+      <w:tblStyleRowBandSize w:val="1"/>
+      <w:tblStyleColBandSize w:val="1"/>
+      <w:tblBorders>
+        <w:top w:val="single" w:sz="4" w:space="0" w:color="60CAF3" w:themeColor="accent4" w:themeTint="99"/>
+        <w:left w:val="single" w:sz="4" w:space="0" w:color="60CAF3" w:themeColor="accent4" w:themeTint="99"/>
+        <w:bottom w:val="single" w:sz="4" w:space="0" w:color="60CAF3" w:themeColor="accent4" w:themeTint="99"/>
+        <w:right w:val="single" w:sz="4" w:space="0" w:color="60CAF3" w:themeColor="accent4" w:themeTint="99"/>
+        <w:insideH w:val="single" w:sz="4" w:space="0" w:color="60CAF3" w:themeColor="accent4" w:themeTint="99"/>
+        <w:insideV w:val="single" w:sz="4" w:space="0" w:color="60CAF3" w:themeColor="accent4" w:themeTint="99"/>
+      </w:tblBorders>
+    </w:tblPr>
+    <w:tblStylePr w:type="firstRow">
+      <w:rPr>
+        <w:b/>
+        <w:bCs/>
+        <w:color w:val="FFFFFF" w:themeColor="background1"/>
+      </w:rPr>
+      <w:tblPr/>
+      <w:tcPr>
+        <w:tcBorders>
+          <w:top w:val="single" w:sz="4" w:space="0" w:color="0F9ED5" w:themeColor="accent4"/>
+          <w:left w:val="single" w:sz="4" w:space="0" w:color="0F9ED5" w:themeColor="accent4"/>
+          <w:bottom w:val="single" w:sz="4" w:space="0" w:color="0F9ED5" w:themeColor="accent4"/>
+          <w:right w:val="single" w:sz="4" w:space="0" w:color="0F9ED5" w:themeColor="accent4"/>
+          <w:insideH w:val="nil"/>
+          <w:insideV w:val="nil"/>
+        </w:tcBorders>
+        <w:shd w:val="clear" w:color="auto" w:fill="0F9ED5" w:themeFill="accent4"/>
+      </w:tcPr>
+    </w:tblStylePr>
+    <w:tblStylePr w:type="lastRow">
+      <w:rPr>
+        <w:b/>
+        <w:bCs/>
+      </w:rPr>
+      <w:tblPr/>
+      <w:tcPr>
+        <w:tcBorders>
+          <w:top w:val="double" w:sz="4" w:space="0" w:color="0F9ED5" w:themeColor="accent4"/>
+        </w:tcBorders>
+      </w:tcPr>
+    </w:tblStylePr>
+    <w:tblStylePr w:type="firstCol">
+      <w:rPr>
+        <w:b/>
+        <w:bCs/>
+      </w:rPr>
+    </w:tblStylePr>
+    <w:tblStylePr w:type="lastCol">
+      <w:rPr>
+        <w:b/>
+        <w:bCs/>
+      </w:rPr>
+    </w:tblStylePr>
+    <w:tblStylePr w:type="band1Vert">
+      <w:tblPr/>
+      <w:tcPr>
+        <w:shd w:val="clear" w:color="auto" w:fill="CAEDFB" w:themeFill="accent4" w:themeFillTint="33"/>
+      </w:tcPr>
+    </w:tblStylePr>
+    <w:tblStylePr w:type="band1Horz">
+      <w:tblPr/>
+      <w:tcPr>
+        <w:shd w:val="clear" w:color="auto" w:fill="CAEDFB" w:themeFill="accent4" w:themeFillTint="33"/>
+      </w:tcPr>
+    </w:tblStylePr>
+  </w:style>
 </w:styles>
 </file>
 

</xml_diff>